<commit_message>
Flag Shiovitz-Ezra (2011) for replacement with an open-access source
The entry is refereed but not open access, which the brief for this paper
now requires. Marked in the bibliography and in the README with the
sections that depend on it (2.3, 4.1, and the first conclusion), so the
swap is a single edit once a replacement is chosen.

Not swapping it blind: the candidate Hebrew journals could not be opened
from this environment, and citing a source without reading it is what
produced the Shemtov error corrected in the previous commit.

Co-Authored-By: Claude Opus 5 <noreply@anthropic.com>
Claude-Session: https://claude.ai/code/session_01EM9eEdsFs2QwHu69K8t9fu
</commit_message>
<xml_diff>
--- a/paper/עבודה_אתגר_קרת_דוב_קוטב.docx
+++ b/paper/עבודה_אתגר_קרת_דוב_קוטב.docx
@@ -5363,6 +5363,28 @@
           <w:rtl/>
         </w:rPr>
         <w:t xml:space="preserve">, לא(1), 91-111.</w:t>
+      </w:r>
+    </w:p>
+    <w:p>
+      <w:pPr>
+        <w:bidi/>
+        <w:spacing w:after="160" w:before="0" w:line="360" w:lineRule="auto"/>
+        <w:ind w:right="680"/>
+        <w:jc w:val="right"/>
+      </w:pPr>
+      <w:r>
+        <w:rPr>
+          <w:rFonts w:ascii="David" w:cs="David" w:eastAsia="David" w:hAnsi="David"/>
+          <w:b w:val="false"/>
+          <w:bCs w:val="false"/>
+          <w:i/>
+          <w:iCs/>
+          <w:color w:val="808080"/>
+          <w:sz w:val="24"/>
+          <w:szCs w:val="24"/>
+          <w:rtl/>
+        </w:rPr>
+        <w:t xml:space="preserve">הערת עריכה: המקור הזה שפיט אך אינו בגישה פתוחה. יש להחליפו במאמר שפיט בעברית בגישה מלאה, ולעדכן בהתאם את סעיפים 2.3 ו-4.1 ואת המסקנה הראשונה בפרק 8.</w:t>
       </w:r>
     </w:p>
     <w:p>

</xml_diff>